<commit_message>
Testing to see if new branch change feature on macro works
</commit_message>
<xml_diff>
--- a/System Adminisistration and Security (CPSC 4240)/Discovery3_Benjamin_McDonnough.docx
+++ b/System Adminisistration and Security (CPSC 4240)/Discovery3_Benjamin_McDonnough.docx
@@ -8,6 +8,37 @@
       </w:pPr>
       <w:r>
         <w:t>Discovery 3</w:t>
+      </w:r>
+    </w:p>
+    <w:p>
+      <w:pPr>
+        <w:jc w:val="center"/>
+      </w:pPr>
+    </w:p>
+    <w:p>
+      <w:pPr>
+        <w:jc w:val="center"/>
+      </w:pPr>
+    </w:p>
+    <w:p>
+      <w:pPr>
+        <w:jc w:val="center"/>
+      </w:pPr>
+      <w:r>
+        <w:t>I really hope that this works</w:t>
+      </w:r>
+    </w:p>
+    <w:p>
+      <w:pPr>
+        <w:jc w:val="center"/>
+      </w:pPr>
+    </w:p>
+    <w:p>
+      <w:pPr>
+        <w:jc w:val="center"/>
+      </w:pPr>
+      <w:r>
+        <w:t>Yippee</w:t>
       </w:r>
     </w:p>
     <w:sectPr>

</xml_diff>

<commit_message>
Testing the macro again
</commit_message>
<xml_diff>
--- a/System Adminisistration and Security (CPSC 4240)/Discovery3_Benjamin_McDonnough.docx
+++ b/System Adminisistration and Security (CPSC 4240)/Discovery3_Benjamin_McDonnough.docx
@@ -69,6 +69,19 @@
       <w:r>
         <w:t>Yippee</w:t>
       </w:r>
+    </w:p>
+    <w:p>
+      <w:pPr>
+        <w:jc w:val="center"/>
+      </w:pPr>
+      <w:r>
+        <w:t>Trying again</w:t>
+      </w:r>
+    </w:p>
+    <w:p>
+      <w:pPr>
+        <w:jc w:val="center"/>
+      </w:pPr>
     </w:p>
     <w:p>
       <w:pPr>

</xml_diff>

<commit_message>
Final test for macro
</commit_message>
<xml_diff>
--- a/System Adminisistration and Security (CPSC 4240)/Discovery3_Benjamin_McDonnough.docx
+++ b/System Adminisistration and Security (CPSC 4240)/Discovery3_Benjamin_McDonnough.docx
@@ -76,6 +76,14 @@
       </w:pPr>
       <w:r>
         <w:t>Trying again</w:t>
+      </w:r>
+    </w:p>
+    <w:p>
+      <w:pPr>
+        <w:jc w:val="center"/>
+      </w:pPr>
+      <w:r>
+        <w:t>Yippee it works</w:t>
       </w:r>
     </w:p>
     <w:p>

</xml_diff>